<commit_message>
criei diretórios, documentos word, pdf e reorganizei arquivos
- Criação de pastas: atividades e atividades-fórum
- Criação de pastas: aula02 e aula03
- Criação de documentos: atividades.docx e atividades.pdf
</commit_message>
<xml_diff>
--- a/semestre-1/tecnologia-da-informaçao-1/resumos/resumo-aula02-ti1.docx
+++ b/semestre-1/tecnologia-da-informaçao-1/resumos/resumo-aula02-ti1.docx
@@ -158,7 +158,7 @@
                     <pic:cNvPicPr/>
                   </pic:nvPicPr>
                   <pic:blipFill>
-                    <a:blip r:embed="rId5" cstate="print">
+                    <a:blip r:embed="rId6" cstate="print">
                       <a:extLst>
                         <a:ext uri="{28A0092B-C50C-407E-A947-70E740481C1C}">
                           <a14:useLocalDpi xmlns:a14="http://schemas.microsoft.com/office/drawing/2010/main" val="0"/>
@@ -716,7 +716,7 @@
                     </pic:cNvPicPr>
                   </pic:nvPicPr>
                   <pic:blipFill>
-                    <a:blip r:embed="rId6">
+                    <a:blip r:embed="rId7">
                       <a:extLst>
                         <a:ext uri="{28A0092B-C50C-407E-A947-70E740481C1C}">
                           <a14:useLocalDpi xmlns:a14="http://schemas.microsoft.com/office/drawing/2010/main" val="0"/>
@@ -766,7 +766,7 @@
           <w:szCs w:val="24"/>
         </w:rPr>
       </w:pPr>
-      <w:hyperlink r:id="rId7" w:history="1">
+      <w:hyperlink r:id="rId8" w:history="1">
         <w:r>
           <w:rPr>
             <w:rStyle w:val="Hyperlink"/>
@@ -805,7 +805,7 @@
           <w:szCs w:val="24"/>
         </w:rPr>
       </w:pPr>
-      <w:hyperlink r:id="rId8" w:history="1">
+      <w:hyperlink r:id="rId9" w:history="1">
         <w:r>
           <w:rPr>
             <w:rStyle w:val="Hyperlink"/>
@@ -851,7 +851,7 @@
           <w:szCs w:val="24"/>
         </w:rPr>
       </w:pPr>
-      <w:hyperlink r:id="rId9" w:history="1">
+      <w:hyperlink r:id="rId10" w:history="1">
         <w:r>
           <w:rPr>
             <w:rStyle w:val="Hyperlink"/>
@@ -1276,6 +1276,14 @@
         </w:rPr>
         <w:t>Vários usuários podem usar simultaneamente.</w:t>
       </w:r>
+      <w:r>
+        <w:rPr>
+          <w:rFonts w:ascii="Arial" w:hAnsi="Arial" w:cs="Arial"/>
+          <w:sz w:val="24"/>
+          <w:szCs w:val="24"/>
+        </w:rPr>
+        <w:t xml:space="preserve"> Geralmente é ligado na rede</w:t>
+      </w:r>
     </w:p>
     <w:p>
       <w:pPr>
@@ -1295,7 +1303,7 @@
           <w:szCs w:val="24"/>
         </w:rPr>
       </w:pPr>
-      <w:hyperlink r:id="rId10" w:history="1">
+      <w:hyperlink r:id="rId11" w:history="1">
         <w:r>
           <w:rPr>
             <w:rStyle w:val="Hyperlink"/>
@@ -1391,6 +1399,24 @@
           <w:sz w:val="24"/>
           <w:szCs w:val="24"/>
         </w:rPr>
+        <w:t xml:space="preserve">Esses bits são a </w:t>
+      </w:r>
+      <w:r>
+        <w:rPr>
+          <w:rFonts w:ascii="Arial" w:hAnsi="Arial" w:cs="Arial"/>
+          <w:b/>
+          <w:bCs/>
+          <w:sz w:val="24"/>
+          <w:szCs w:val="24"/>
+        </w:rPr>
+        <w:t xml:space="preserve">Arquitetura de memória do SO. </w:t>
+      </w:r>
+      <w:r>
+        <w:rPr>
+          <w:rFonts w:ascii="Arial" w:hAnsi="Arial" w:cs="Arial"/>
+          <w:sz w:val="24"/>
+          <w:szCs w:val="24"/>
+        </w:rPr>
         <w:t xml:space="preserve">Está ligado com a quantidade de </w:t>
       </w:r>
       <w:r>
@@ -1643,7 +1669,7 @@
           <w:szCs w:val="24"/>
         </w:rPr>
       </w:pPr>
-      <w:hyperlink r:id="rId11" w:history="1">
+      <w:hyperlink r:id="rId12" w:history="1">
         <w:r>
           <w:rPr>
             <w:rStyle w:val="Hyperlink"/>
@@ -1698,7 +1724,7 @@
           <w:szCs w:val="24"/>
         </w:rPr>
       </w:pPr>
-      <w:hyperlink r:id="rId12" w:history="1">
+      <w:hyperlink r:id="rId13" w:history="1">
         <w:r>
           <w:rPr>
             <w:rStyle w:val="Hyperlink"/>
@@ -1932,7 +1958,7 @@
           <w:szCs w:val="24"/>
         </w:rPr>
       </w:pPr>
-      <w:hyperlink r:id="rId13" w:history="1">
+      <w:hyperlink r:id="rId14" w:history="1">
         <w:r>
           <w:rPr>
             <w:rStyle w:val="Hyperlink"/>
@@ -1974,120 +2000,6 @@
           <w:szCs w:val="24"/>
         </w:rPr>
       </w:pPr>
-      <w:hyperlink r:id="rId14" w:history="1">
-        <w:r>
-          <w:rPr>
-            <w:rStyle w:val="Hyperlink"/>
-            <w:rFonts w:ascii="Arial" w:hAnsi="Arial" w:cs="Arial"/>
-            <w:b/>
-            <w:bCs/>
-            <w:sz w:val="24"/>
-            <w:szCs w:val="24"/>
-          </w:rPr>
-          <w:t>https://www.tecmundo.com.br/s</w:t>
-        </w:r>
-        <w:r>
-          <w:rPr>
-            <w:rStyle w:val="Hyperlink"/>
-            <w:rFonts w:ascii="Arial" w:hAnsi="Arial" w:cs="Arial"/>
-            <w:b/>
-            <w:bCs/>
-            <w:sz w:val="24"/>
-            <w:szCs w:val="24"/>
-          </w:rPr>
-          <w:t>i</w:t>
-        </w:r>
-        <w:r>
-          <w:rPr>
-            <w:rStyle w:val="Hyperlink"/>
-            <w:rFonts w:ascii="Arial" w:hAnsi="Arial" w:cs="Arial"/>
-            <w:b/>
-            <w:bCs/>
-            <w:sz w:val="24"/>
-            <w:szCs w:val="24"/>
-          </w:rPr>
-          <w:t>ste-ma-operacional/2031-a-historia-dos-sistemas-operacionais-ilustracao-.htm</w:t>
-        </w:r>
-      </w:hyperlink>
-      <w:r>
-        <w:rPr>
-          <w:rFonts w:ascii="Arial" w:hAnsi="Arial" w:cs="Arial"/>
-          <w:b/>
-          <w:bCs/>
-          <w:sz w:val="24"/>
-          <w:szCs w:val="24"/>
-        </w:rPr>
-        <w:t xml:space="preserve"> </w:t>
-      </w:r>
-      <w:r>
-        <w:rPr>
-          <w:rFonts w:ascii="Arial" w:hAnsi="Arial" w:cs="Arial"/>
-          <w:b/>
-          <w:bCs/>
-          <w:sz w:val="24"/>
-          <w:szCs w:val="24"/>
-        </w:rPr>
-        <w:t xml:space="preserve"> </w:t>
-      </w:r>
-      <w:r>
-        <w:rPr>
-          <w:rFonts w:ascii="Arial" w:hAnsi="Arial" w:cs="Arial"/>
-          <w:b/>
-          <w:bCs/>
-          <w:sz w:val="24"/>
-          <w:szCs w:val="24"/>
-        </w:rPr>
-        <w:t xml:space="preserve"> </w:t>
-      </w:r>
-      <w:r>
-        <w:rPr>
-          <w:rFonts w:ascii="Arial" w:hAnsi="Arial" w:cs="Arial"/>
-          <w:b/>
-          <w:bCs/>
-          <w:sz w:val="24"/>
-          <w:szCs w:val="24"/>
-        </w:rPr>
-        <w:t>(</w:t>
-      </w:r>
-      <w:r>
-        <w:rPr>
-          <w:rFonts w:ascii="Arial" w:hAnsi="Arial" w:cs="Arial"/>
-          <w:b/>
-          <w:bCs/>
-          <w:sz w:val="24"/>
-          <w:szCs w:val="24"/>
-        </w:rPr>
-        <w:t>Artigo – Infográfico sobre história dos Sistemas Operacionais</w:t>
-      </w:r>
-      <w:r>
-        <w:rPr>
-          <w:rFonts w:ascii="Arial" w:hAnsi="Arial" w:cs="Arial"/>
-          <w:b/>
-          <w:bCs/>
-          <w:sz w:val="24"/>
-          <w:szCs w:val="24"/>
-        </w:rPr>
-        <w:t>)</w:t>
-      </w:r>
-    </w:p>
-    <w:p>
-      <w:pPr>
-        <w:pStyle w:val="PargrafodaLista"/>
-        <w:numPr>
-          <w:ilvl w:val="0"/>
-          <w:numId w:val="18"/>
-        </w:numPr>
-        <w:spacing w:line="360" w:lineRule="auto"/>
-        <w:ind w:left="0"/>
-        <w:jc w:val="both"/>
-        <w:rPr>
-          <w:rFonts w:ascii="Arial" w:hAnsi="Arial" w:cs="Arial"/>
-          <w:b/>
-          <w:bCs/>
-          <w:sz w:val="24"/>
-          <w:szCs w:val="24"/>
-        </w:rPr>
-      </w:pPr>
       <w:hyperlink r:id="rId15" w:history="1">
         <w:r>
           <w:rPr>
@@ -2098,29 +2010,7 @@
             <w:sz w:val="24"/>
             <w:szCs w:val="24"/>
           </w:rPr>
-          <w:t>https://www.hardware.com.br/artigos/computacao-ubiq</w:t>
-        </w:r>
-        <w:r>
-          <w:rPr>
-            <w:rStyle w:val="Hyperlink"/>
-            <w:rFonts w:ascii="Arial" w:hAnsi="Arial" w:cs="Arial"/>
-            <w:b/>
-            <w:bCs/>
-            <w:sz w:val="24"/>
-            <w:szCs w:val="24"/>
-          </w:rPr>
-          <w:t>u</w:t>
-        </w:r>
-        <w:r>
-          <w:rPr>
-            <w:rStyle w:val="Hyperlink"/>
-            <w:rFonts w:ascii="Arial" w:hAnsi="Arial" w:cs="Arial"/>
-            <w:b/>
-            <w:bCs/>
-            <w:sz w:val="24"/>
-            <w:szCs w:val="24"/>
-          </w:rPr>
-          <w:t>a/</w:t>
+          <w:t>https://www.tecmundo.com.br/siste-ma-operacional/2031-a-historia-dos-sistemas-operacionais-ilustracao-.htm</w:t>
         </w:r>
       </w:hyperlink>
       <w:r>
@@ -2151,37 +2041,7 @@
           <w:sz w:val="24"/>
           <w:szCs w:val="24"/>
         </w:rPr>
-        <w:t xml:space="preserve"> </w:t>
-      </w:r>
-      <w:r>
-        <w:rPr>
-          <w:rFonts w:ascii="Arial" w:hAnsi="Arial" w:cs="Arial"/>
-          <w:b/>
-          <w:bCs/>
-          <w:sz w:val="24"/>
-          <w:szCs w:val="24"/>
-        </w:rPr>
-        <w:t xml:space="preserve"> (Artigo – </w:t>
-      </w:r>
-      <w:r>
-        <w:rPr>
-          <w:rFonts w:ascii="Arial" w:hAnsi="Arial" w:cs="Arial"/>
-          <w:b/>
-          <w:bCs/>
-          <w:sz w:val="24"/>
-          <w:szCs w:val="24"/>
-        </w:rPr>
-        <w:t>Computação ubíqua</w:t>
-      </w:r>
-      <w:r>
-        <w:rPr>
-          <w:rFonts w:ascii="Arial" w:hAnsi="Arial" w:cs="Arial"/>
-          <w:b/>
-          <w:bCs/>
-          <w:sz w:val="24"/>
-          <w:szCs w:val="24"/>
-        </w:rPr>
-        <w:t>)</w:t>
+        <w:t xml:space="preserve"> (Artigo – Infográfico sobre história dos Sistemas Operacionais)</w:t>
       </w:r>
     </w:p>
     <w:p>
@@ -2212,29 +2072,7 @@
             <w:sz w:val="24"/>
             <w:szCs w:val="24"/>
           </w:rPr>
-          <w:t>https://ics.uci.edu/~corps/phaseii/Weiser-Computer21s</w:t>
-        </w:r>
-        <w:r>
-          <w:rPr>
-            <w:rStyle w:val="Hyperlink"/>
-            <w:rFonts w:ascii="Arial" w:hAnsi="Arial" w:cs="Arial"/>
-            <w:b/>
-            <w:bCs/>
-            <w:sz w:val="24"/>
-            <w:szCs w:val="24"/>
-          </w:rPr>
-          <w:t>t</w:t>
-        </w:r>
-        <w:r>
-          <w:rPr>
-            <w:rStyle w:val="Hyperlink"/>
-            <w:rFonts w:ascii="Arial" w:hAnsi="Arial" w:cs="Arial"/>
-            <w:b/>
-            <w:bCs/>
-            <w:sz w:val="24"/>
-            <w:szCs w:val="24"/>
-          </w:rPr>
-          <w:t>Century-SciAm.pdf</w:t>
+          <w:t>https://www.hardware.com.br/artigos/computacao-ubiqua/</w:t>
         </w:r>
       </w:hyperlink>
       <w:r>
@@ -2245,6 +2083,16 @@
           <w:sz w:val="24"/>
           <w:szCs w:val="24"/>
         </w:rPr>
+        <w:t xml:space="preserve">  </w:t>
+      </w:r>
+      <w:r>
+        <w:rPr>
+          <w:rFonts w:ascii="Arial" w:hAnsi="Arial" w:cs="Arial"/>
+          <w:b/>
+          <w:bCs/>
+          <w:sz w:val="24"/>
+          <w:szCs w:val="24"/>
+        </w:rPr>
         <w:t xml:space="preserve"> </w:t>
       </w:r>
       <w:r>
@@ -2255,17 +2103,7 @@
           <w:sz w:val="24"/>
           <w:szCs w:val="24"/>
         </w:rPr>
-        <w:t xml:space="preserve"> (Artigo – </w:t>
-      </w:r>
-      <w:r>
-        <w:rPr>
-          <w:rFonts w:ascii="Arial" w:hAnsi="Arial" w:cs="Arial"/>
-          <w:b/>
-          <w:bCs/>
-          <w:sz w:val="24"/>
-          <w:szCs w:val="24"/>
-        </w:rPr>
-        <w:t>The Computer for the 21st Century)</w:t>
+        <w:t xml:space="preserve"> (Artigo – Computação ubíqua)</w:t>
       </w:r>
     </w:p>
     <w:p>
@@ -2338,7 +2176,7 @@
             <w:sz w:val="24"/>
             <w:szCs w:val="24"/>
           </w:rPr>
-          <w:t>https://www.academia.edu/3104700/Computa%C3%A7%C3%A3o_ub%C3%ADqua_Princ%C3%ADpios_tecnologias_e_desafios</w:t>
+          <w:t>https://ics.uci.edu/~corps/phaseii/Weiser-Computer21stCentury-SciAm.pdf</w:t>
         </w:r>
       </w:hyperlink>
       <w:r>
@@ -2349,7 +2187,7 @@
           <w:sz w:val="24"/>
           <w:szCs w:val="24"/>
         </w:rPr>
-        <w:t xml:space="preserve"> (Computação ubíqua: princípios, tecnologias e desafios)</w:t>
+        <w:t xml:space="preserve">  (Artigo – The Computer for the 21st Century)</w:t>
       </w:r>
     </w:p>
     <w:p>
@@ -2379,33 +2217,8 @@
             <w:bCs/>
             <w:sz w:val="24"/>
             <w:szCs w:val="24"/>
-            <w:highlight w:val="yellow"/>
           </w:rPr>
-          <w:t>https://www.youtube.com/watch?v=eVD9s</w:t>
-        </w:r>
-        <w:r>
-          <w:rPr>
-            <w:rStyle w:val="Hyperlink"/>
-            <w:rFonts w:ascii="Arial" w:hAnsi="Arial" w:cs="Arial"/>
-            <w:b/>
-            <w:bCs/>
-            <w:sz w:val="24"/>
-            <w:szCs w:val="24"/>
-            <w:highlight w:val="yellow"/>
-          </w:rPr>
-          <w:t>i</w:t>
-        </w:r>
-        <w:r>
-          <w:rPr>
-            <w:rStyle w:val="Hyperlink"/>
-            <w:rFonts w:ascii="Arial" w:hAnsi="Arial" w:cs="Arial"/>
-            <w:b/>
-            <w:bCs/>
-            <w:sz w:val="24"/>
-            <w:szCs w:val="24"/>
-            <w:highlight w:val="yellow"/>
-          </w:rPr>
-          <w:t>K8WzU</w:t>
+          <w:t>https://www.academia.edu/3104700/Computa%C3%A7%C3%A3o_ub%C3%ADqua_Princ%C3%ADpios_tecnologias_e_desafios</w:t>
         </w:r>
       </w:hyperlink>
       <w:r>
@@ -2416,37 +2229,7 @@
           <w:sz w:val="24"/>
           <w:szCs w:val="24"/>
         </w:rPr>
-        <w:t xml:space="preserve"> </w:t>
-      </w:r>
-      <w:r>
-        <w:rPr>
-          <w:rFonts w:ascii="Arial" w:hAnsi="Arial" w:cs="Arial"/>
-          <w:b/>
-          <w:bCs/>
-          <w:sz w:val="24"/>
-          <w:szCs w:val="24"/>
-        </w:rPr>
-        <w:t>(</w:t>
-      </w:r>
-      <w:r>
-        <w:rPr>
-          <w:rFonts w:ascii="Arial" w:hAnsi="Arial" w:cs="Arial"/>
-          <w:b/>
-          <w:bCs/>
-          <w:sz w:val="24"/>
-          <w:szCs w:val="24"/>
-        </w:rPr>
-        <w:t>Linux – Dicionário do Programador</w:t>
-      </w:r>
-      <w:r>
-        <w:rPr>
-          <w:rFonts w:ascii="Arial" w:hAnsi="Arial" w:cs="Arial"/>
-          <w:b/>
-          <w:bCs/>
-          <w:sz w:val="24"/>
-          <w:szCs w:val="24"/>
-        </w:rPr>
-        <w:t>)</w:t>
+        <w:t xml:space="preserve"> (Computação ubíqua: princípios, tecnologias e desafios)</w:t>
       </w:r>
     </w:p>
     <w:p>
@@ -2467,16 +2250,6 @@
           <w:szCs w:val="24"/>
         </w:rPr>
       </w:pPr>
-      <w:r>
-        <w:rPr>
-          <w:rFonts w:ascii="Arial" w:hAnsi="Arial" w:cs="Arial"/>
-          <w:b/>
-          <w:bCs/>
-          <w:sz w:val="24"/>
-          <w:szCs w:val="24"/>
-        </w:rPr>
-        <w:t xml:space="preserve"> </w:t>
-      </w:r>
       <w:hyperlink r:id="rId20" w:history="1">
         <w:r>
           <w:rPr>
@@ -2488,8 +2261,59 @@
             <w:szCs w:val="24"/>
             <w:highlight w:val="yellow"/>
           </w:rPr>
-          <w:t>https://www.youtube.com/watch?v=K1d3PwRth</w:t>
+          <w:t>https://www.youtube.com/watch?v=eVD9siK8WzU</w:t>
         </w:r>
+      </w:hyperlink>
+      <w:r>
+        <w:rPr>
+          <w:rFonts w:ascii="Arial" w:hAnsi="Arial" w:cs="Arial"/>
+          <w:b/>
+          <w:bCs/>
+          <w:sz w:val="24"/>
+          <w:szCs w:val="24"/>
+        </w:rPr>
+        <w:t xml:space="preserve"> (Linux – Dicionário do Programador</w:t>
+      </w:r>
+      <w:r>
+        <w:rPr>
+          <w:rFonts w:ascii="Arial" w:hAnsi="Arial" w:cs="Arial"/>
+          <w:b/>
+          <w:bCs/>
+          <w:sz w:val="24"/>
+          <w:szCs w:val="24"/>
+        </w:rPr>
+        <w:t>)</w:t>
+      </w:r>
+    </w:p>
+    <w:p>
+      <w:pPr>
+        <w:pStyle w:val="PargrafodaLista"/>
+        <w:numPr>
+          <w:ilvl w:val="0"/>
+          <w:numId w:val="18"/>
+        </w:numPr>
+        <w:spacing w:line="360" w:lineRule="auto"/>
+        <w:ind w:left="0"/>
+        <w:jc w:val="both"/>
+        <w:rPr>
+          <w:rFonts w:ascii="Arial" w:hAnsi="Arial" w:cs="Arial"/>
+          <w:b/>
+          <w:bCs/>
+          <w:sz w:val="24"/>
+          <w:szCs w:val="24"/>
+        </w:rPr>
+      </w:pPr>
+      <w:r>
+        <w:rPr>
+          <w:rFonts w:ascii="Arial" w:hAnsi="Arial" w:cs="Arial"/>
+          <w:b/>
+          <w:bCs/>
+          <w:sz w:val="24"/>
+          <w:szCs w:val="24"/>
+        </w:rPr>
+        <w:t xml:space="preserve"> </w:t>
+      </w:r>
+      <w:hyperlink r:id="rId21" w:history="1">
         <w:r>
           <w:rPr>
             <w:rStyle w:val="Hyperlink"/>
@@ -2500,19 +2324,7 @@
             <w:szCs w:val="24"/>
             <w:highlight w:val="yellow"/>
           </w:rPr>
-          <w:t>D</w:t>
-        </w:r>
-        <w:r>
-          <w:rPr>
-            <w:rStyle w:val="Hyperlink"/>
-            <w:rFonts w:ascii="Arial" w:hAnsi="Arial" w:cs="Arial"/>
-            <w:b/>
-            <w:bCs/>
-            <w:sz w:val="24"/>
-            <w:szCs w:val="24"/>
-            <w:highlight w:val="yellow"/>
-          </w:rPr>
-          <w:t>w</w:t>
+          <w:t>https://www.youtube.com/watch?v=K1d3PwRthDw</w:t>
         </w:r>
       </w:hyperlink>
       <w:r>
@@ -2523,27 +2335,7 @@
           <w:sz w:val="24"/>
           <w:szCs w:val="24"/>
         </w:rPr>
-        <w:t xml:space="preserve"> </w:t>
-      </w:r>
-      <w:r>
-        <w:rPr>
-          <w:rFonts w:ascii="Arial" w:hAnsi="Arial" w:cs="Arial"/>
-          <w:b/>
-          <w:bCs/>
-          <w:sz w:val="24"/>
-          <w:szCs w:val="24"/>
-        </w:rPr>
-        <w:t>(</w:t>
-      </w:r>
-      <w:r>
-        <w:rPr>
-          <w:rFonts w:ascii="Arial" w:hAnsi="Arial" w:cs="Arial"/>
-          <w:b/>
-          <w:bCs/>
-          <w:sz w:val="24"/>
-          <w:szCs w:val="24"/>
-        </w:rPr>
-        <w:t>Informática – Módulo 1 – Agenda 7</w:t>
+        <w:t xml:space="preserve"> (Informática – Módulo 1 – Agenda 7</w:t>
       </w:r>
       <w:r>
         <w:rPr>
@@ -2584,7 +2376,7 @@
           <w:szCs w:val="24"/>
         </w:rPr>
       </w:pPr>
-      <w:hyperlink r:id="rId21" w:history="1">
+      <w:hyperlink r:id="rId22" w:history="1">
         <w:r>
           <w:rPr>
             <w:rStyle w:val="Hyperlink"/>
@@ -2626,27 +2418,7 @@
           <w:sz w:val="24"/>
           <w:szCs w:val="24"/>
         </w:rPr>
-        <w:t xml:space="preserve">(Informática – Módulo 1 – Agenda </w:t>
-      </w:r>
-      <w:r>
-        <w:rPr>
-          <w:rFonts w:ascii="Arial" w:hAnsi="Arial" w:cs="Arial"/>
-          <w:b/>
-          <w:bCs/>
-          <w:sz w:val="24"/>
-          <w:szCs w:val="24"/>
-        </w:rPr>
-        <w:t>8</w:t>
-      </w:r>
-      <w:r>
-        <w:rPr>
-          <w:rFonts w:ascii="Arial" w:hAnsi="Arial" w:cs="Arial"/>
-          <w:b/>
-          <w:bCs/>
-          <w:sz w:val="24"/>
-          <w:szCs w:val="24"/>
-        </w:rPr>
-        <w:t xml:space="preserve"> - GEEaD)</w:t>
+        <w:t>(Informática – Módulo 1 – Agenda 8 - GEEaD)</w:t>
       </w:r>
     </w:p>
     <w:p>
@@ -2667,7 +2439,7 @@
           <w:szCs w:val="24"/>
         </w:rPr>
       </w:pPr>
-      <w:hyperlink r:id="rId22" w:history="1">
+      <w:hyperlink r:id="rId23" w:history="1">
         <w:r>
           <w:rPr>
             <w:rStyle w:val="Hyperlink"/>
@@ -2677,29 +2449,7 @@
             <w:sz w:val="24"/>
             <w:szCs w:val="24"/>
           </w:rPr>
-          <w:t>https://www.youtube.com/</w:t>
-        </w:r>
-        <w:r>
-          <w:rPr>
-            <w:rStyle w:val="Hyperlink"/>
-            <w:rFonts w:ascii="Arial" w:hAnsi="Arial" w:cs="Arial"/>
-            <w:b/>
-            <w:bCs/>
-            <w:sz w:val="24"/>
-            <w:szCs w:val="24"/>
-          </w:rPr>
-          <w:t>w</w:t>
-        </w:r>
-        <w:r>
-          <w:rPr>
-            <w:rStyle w:val="Hyperlink"/>
-            <w:rFonts w:ascii="Arial" w:hAnsi="Arial" w:cs="Arial"/>
-            <w:b/>
-            <w:bCs/>
-            <w:sz w:val="24"/>
-            <w:szCs w:val="24"/>
-          </w:rPr>
-          <w:t>atch?v=0Fjwg6q_cfI</w:t>
+          <w:t>https://www.youtube.com/watch?v=0Fjwg6q_cfI</w:t>
         </w:r>
       </w:hyperlink>
       <w:r>
@@ -2710,37 +2460,7 @@
           <w:sz w:val="24"/>
           <w:szCs w:val="24"/>
         </w:rPr>
-        <w:t xml:space="preserve"> </w:t>
-      </w:r>
-      <w:r>
-        <w:rPr>
-          <w:rFonts w:ascii="Arial" w:hAnsi="Arial" w:cs="Arial"/>
-          <w:b/>
-          <w:bCs/>
-          <w:sz w:val="24"/>
-          <w:szCs w:val="24"/>
-        </w:rPr>
-        <w:t>(</w:t>
-      </w:r>
-      <w:r>
-        <w:rPr>
-          <w:rFonts w:ascii="Arial" w:hAnsi="Arial" w:cs="Arial"/>
-          <w:b/>
-          <w:bCs/>
-          <w:sz w:val="24"/>
-          <w:szCs w:val="24"/>
-        </w:rPr>
-        <w:t>A história do Windows - Tecmundo</w:t>
-      </w:r>
-      <w:r>
-        <w:rPr>
-          <w:rFonts w:ascii="Arial" w:hAnsi="Arial" w:cs="Arial"/>
-          <w:b/>
-          <w:bCs/>
-          <w:sz w:val="24"/>
-          <w:szCs w:val="24"/>
-        </w:rPr>
-        <w:t>)</w:t>
+        <w:t xml:space="preserve"> (A história do Windows - Tecmundo)</w:t>
       </w:r>
     </w:p>
     <w:p>
@@ -2761,7 +2481,7 @@
           <w:szCs w:val="24"/>
         </w:rPr>
       </w:pPr>
-      <w:hyperlink r:id="rId23" w:history="1">
+      <w:hyperlink r:id="rId24" w:history="1">
         <w:r>
           <w:rPr>
             <w:rStyle w:val="Hyperlink"/>
@@ -2782,37 +2502,7 @@
           <w:sz w:val="24"/>
           <w:szCs w:val="24"/>
         </w:rPr>
-        <w:t xml:space="preserve"> </w:t>
-      </w:r>
-      <w:r>
-        <w:rPr>
-          <w:rFonts w:ascii="Arial" w:hAnsi="Arial" w:cs="Arial"/>
-          <w:b/>
-          <w:bCs/>
-          <w:sz w:val="24"/>
-          <w:szCs w:val="24"/>
-        </w:rPr>
-        <w:t>(</w:t>
-      </w:r>
-      <w:r>
-        <w:rPr>
-          <w:rFonts w:ascii="Arial" w:hAnsi="Arial" w:cs="Arial"/>
-          <w:b/>
-          <w:bCs/>
-          <w:sz w:val="24"/>
-          <w:szCs w:val="24"/>
-        </w:rPr>
-        <w:t>Olhar Digital – Linux vc Windows – semelhanças e diferenças</w:t>
-      </w:r>
-      <w:r>
-        <w:rPr>
-          <w:rFonts w:ascii="Arial" w:hAnsi="Arial" w:cs="Arial"/>
-          <w:b/>
-          <w:bCs/>
-          <w:sz w:val="24"/>
-          <w:szCs w:val="24"/>
-        </w:rPr>
-        <w:t>)</w:t>
+        <w:t xml:space="preserve"> (Olhar Digital – Linux vc Windows – semelhanças e diferenças)</w:t>
       </w:r>
     </w:p>
     <w:p>
@@ -2902,6 +2592,7 @@
           <w:sz w:val="24"/>
           <w:szCs w:val="24"/>
         </w:rPr>
+        <w:lastRenderedPageBreak/>
         <w:tab/>
       </w:r>
       <w:r>
@@ -2934,16 +2625,7 @@
           <w:sz w:val="24"/>
           <w:szCs w:val="24"/>
         </w:rPr>
-        <w:t xml:space="preserve"> É possível criar arquivos </w:t>
-      </w:r>
-      <w:r>
-        <w:rPr>
-          <w:rFonts w:ascii="Arial" w:hAnsi="Arial" w:cs="Arial"/>
-          <w:sz w:val="24"/>
-          <w:szCs w:val="24"/>
-        </w:rPr>
-        <w:lastRenderedPageBreak/>
-        <w:t xml:space="preserve">de lote </w:t>
+        <w:t xml:space="preserve"> É possível criar arquivos de lote </w:t>
       </w:r>
       <w:r>
         <w:rPr>
@@ -3795,6 +3477,204 @@
         <w:jc w:val="both"/>
         <w:rPr>
           <w:rFonts w:ascii="Arial" w:hAnsi="Arial" w:cs="Arial"/>
+          <w:b/>
+          <w:bCs/>
+          <w:sz w:val="24"/>
+          <w:szCs w:val="24"/>
+        </w:rPr>
+      </w:pPr>
+      <w:r>
+        <w:rPr>
+          <w:rFonts w:ascii="Arial" w:hAnsi="Arial" w:cs="Arial"/>
+          <w:b/>
+          <w:bCs/>
+          <w:sz w:val="24"/>
+          <w:szCs w:val="24"/>
+        </w:rPr>
+        <w:t>Encontro Síncrono turma EDO (27/02/2025):</w:t>
+      </w:r>
+      <w:r>
+        <w:rPr>
+          <w:rFonts w:ascii="Arial" w:hAnsi="Arial" w:cs="Arial"/>
+          <w:b/>
+          <w:bCs/>
+          <w:sz w:val="24"/>
+          <w:szCs w:val="24"/>
+        </w:rPr>
+        <w:t xml:space="preserve"> </w:t>
+      </w:r>
+      <w:hyperlink r:id="rId25" w:history="1">
+        <w:r>
+          <w:rPr>
+            <w:rStyle w:val="Hyperlink"/>
+            <w:rFonts w:ascii="Arial" w:hAnsi="Arial" w:cs="Arial"/>
+            <w:b/>
+            <w:bCs/>
+            <w:sz w:val="24"/>
+            <w:szCs w:val="24"/>
+          </w:rPr>
+          <w:t>https://www.youtube.com/watch?v=6gD3H2x</w:t>
+        </w:r>
+        <w:r>
+          <w:rPr>
+            <w:rStyle w:val="Hyperlink"/>
+            <w:rFonts w:ascii="Arial" w:hAnsi="Arial" w:cs="Arial"/>
+            <w:b/>
+            <w:bCs/>
+            <w:sz w:val="24"/>
+            <w:szCs w:val="24"/>
+          </w:rPr>
+          <w:t>Y</w:t>
+        </w:r>
+        <w:r>
+          <w:rPr>
+            <w:rStyle w:val="Hyperlink"/>
+            <w:rFonts w:ascii="Arial" w:hAnsi="Arial" w:cs="Arial"/>
+            <w:b/>
+            <w:bCs/>
+            <w:sz w:val="24"/>
+            <w:szCs w:val="24"/>
+          </w:rPr>
+          <w:t>11A</w:t>
+        </w:r>
+      </w:hyperlink>
+      <w:r>
+        <w:rPr>
+          <w:rFonts w:ascii="Arial" w:hAnsi="Arial" w:cs="Arial"/>
+          <w:b/>
+          <w:bCs/>
+          <w:sz w:val="24"/>
+          <w:szCs w:val="24"/>
+        </w:rPr>
+        <w:t xml:space="preserve"> </w:t>
+      </w:r>
+    </w:p>
+    <w:p>
+      <w:pPr>
+        <w:spacing w:line="360" w:lineRule="auto"/>
+        <w:jc w:val="both"/>
+        <w:rPr>
+          <w:rFonts w:ascii="Arial" w:hAnsi="Arial" w:cs="Arial"/>
+          <w:sz w:val="24"/>
+          <w:szCs w:val="24"/>
+        </w:rPr>
+      </w:pPr>
+      <w:r>
+        <w:rPr>
+          <w:rFonts w:ascii="Arial" w:hAnsi="Arial" w:cs="Arial"/>
+          <w:b/>
+          <w:bCs/>
+          <w:sz w:val="24"/>
+          <w:szCs w:val="24"/>
+        </w:rPr>
+        <w:t xml:space="preserve">Software: </w:t>
+      </w:r>
+      <w:r>
+        <w:rPr>
+          <w:rFonts w:ascii="Arial" w:hAnsi="Arial" w:cs="Arial"/>
+          <w:sz w:val="24"/>
+          <w:szCs w:val="24"/>
+        </w:rPr>
+        <w:t>é abstrato e não tangível. São sistemas com um conjunto de instruções que faz com que o computador funcione ou opere.</w:t>
+      </w:r>
+    </w:p>
+    <w:p>
+      <w:pPr>
+        <w:spacing w:line="360" w:lineRule="auto"/>
+        <w:jc w:val="both"/>
+        <w:rPr>
+          <w:rFonts w:ascii="Arial" w:hAnsi="Arial" w:cs="Arial"/>
+          <w:sz w:val="24"/>
+          <w:szCs w:val="24"/>
+        </w:rPr>
+      </w:pPr>
+      <w:r>
+        <w:rPr>
+          <w:rFonts w:ascii="Arial" w:hAnsi="Arial" w:cs="Arial"/>
+          <w:b/>
+          <w:bCs/>
+          <w:sz w:val="24"/>
+          <w:szCs w:val="24"/>
+        </w:rPr>
+        <w:t xml:space="preserve">Software Livre </w:t>
+      </w:r>
+      <w:r>
+        <w:rPr>
+          <w:rFonts w:ascii="Arial" w:hAnsi="Arial" w:cs="Arial"/>
+          <w:sz w:val="24"/>
+          <w:szCs w:val="24"/>
+        </w:rPr>
+        <w:t>(permite cópias e modificações)</w:t>
+      </w:r>
+      <w:r>
+        <w:rPr>
+          <w:rFonts w:ascii="Arial" w:hAnsi="Arial" w:cs="Arial"/>
+          <w:b/>
+          <w:bCs/>
+          <w:sz w:val="24"/>
+          <w:szCs w:val="24"/>
+        </w:rPr>
+        <w:t xml:space="preserve"> e Proprietário </w:t>
+      </w:r>
+      <w:r>
+        <w:rPr>
+          <w:rFonts w:ascii="Arial" w:hAnsi="Arial" w:cs="Arial"/>
+          <w:sz w:val="24"/>
+          <w:szCs w:val="24"/>
+        </w:rPr>
+        <w:t>(dono, licença e aluguel)</w:t>
+      </w:r>
+      <w:r>
+        <w:rPr>
+          <w:rFonts w:ascii="Arial" w:hAnsi="Arial" w:cs="Arial"/>
+          <w:sz w:val="24"/>
+          <w:szCs w:val="24"/>
+        </w:rPr>
+        <w:t xml:space="preserve">. </w:t>
+      </w:r>
+      <w:r>
+        <w:rPr>
+          <w:rFonts w:ascii="Arial" w:hAnsi="Arial" w:cs="Arial"/>
+          <w:b/>
+          <w:bCs/>
+          <w:sz w:val="24"/>
+          <w:szCs w:val="24"/>
+        </w:rPr>
+        <w:t xml:space="preserve">Código aberto </w:t>
+      </w:r>
+      <w:r>
+        <w:rPr>
+          <w:rFonts w:ascii="Arial" w:hAnsi="Arial" w:cs="Arial"/>
+          <w:sz w:val="24"/>
+          <w:szCs w:val="24"/>
+        </w:rPr>
+        <w:t xml:space="preserve">(permite modificações e o código é compartilhado) </w:t>
+      </w:r>
+      <w:r>
+        <w:rPr>
+          <w:rFonts w:ascii="Arial" w:hAnsi="Arial" w:cs="Arial"/>
+          <w:b/>
+          <w:bCs/>
+          <w:sz w:val="24"/>
+          <w:szCs w:val="24"/>
+        </w:rPr>
+        <w:t xml:space="preserve">Gratuito </w:t>
+      </w:r>
+      <w:r>
+        <w:rPr>
+          <w:rFonts w:ascii="Arial" w:hAnsi="Arial" w:cs="Arial"/>
+          <w:sz w:val="24"/>
+          <w:szCs w:val="24"/>
+        </w:rPr>
+        <w:t>(sem custo).</w:t>
+      </w:r>
+    </w:p>
+    <w:p>
+      <w:pPr>
+        <w:spacing w:line="360" w:lineRule="auto"/>
+        <w:jc w:val="both"/>
+        <w:rPr>
+          <w:rFonts w:ascii="Arial" w:hAnsi="Arial" w:cs="Arial"/>
           <w:sz w:val="24"/>
           <w:szCs w:val="24"/>
         </w:rPr>
@@ -3866,6 +3746,7 @@
           <w:sz w:val="24"/>
           <w:szCs w:val="24"/>
         </w:rPr>
+        <w:lastRenderedPageBreak/>
         <w:t>Assisti a aula módulo 1 – agenda 7 (informática) – GEEaD. Posso dizer que um SO é composto por vários programas, e o Kernel (Núcleo) é o programa principal de todos os programas que compõem um SO?</w:t>
       </w:r>
     </w:p>
@@ -7168,4 +7049,16 @@
     </a:ext>
   </a:extLst>
 </a:theme>
+</file>
+
+<file path=customXml/item1.xml><?xml version="1.0" encoding="utf-8"?>
+<b:Sources xmlns:b="http://schemas.openxmlformats.org/officeDocument/2006/bibliography" xmlns="http://schemas.openxmlformats.org/officeDocument/2006/bibliography" SelectedStyle="\APASixthEditionOfficeOnline.xsl" StyleName="APA" Version="6"/>
+</file>
+
+<file path=customXml/itemProps1.xml><?xml version="1.0" encoding="utf-8"?>
+<ds:datastoreItem xmlns:ds="http://schemas.openxmlformats.org/officeDocument/2006/customXml" ds:itemID="{F48A5CDE-C304-458E-B970-8F483DFA654D}">
+  <ds:schemaRefs>
+    <ds:schemaRef ds:uri="http://schemas.openxmlformats.org/officeDocument/2006/bibliography"/>
+  </ds:schemaRefs>
+</ds:datastoreItem>
 </file>
</xml_diff>